<commit_message>
Optimising Code And Adding More FlowCharts
</commit_message>
<xml_diff>
--- a/RW25CompletedCodeAndSystemManual/SystemManualTemplate25-26.docx
+++ b/RW25CompletedCodeAndSystemManual/SystemManualTemplate25-26.docx
@@ -3047,37 +3047,115 @@
                 <w:szCs w:val="16"/>
                 <w:highlight w:val="cyan"/>
               </w:rPr>
-              <w:t>“SingleStrokeFont.txt</w:t>
-            </w:r>
+              <w:t>“SingleStrokeFont.txt” doesn’t contain all the data</w:t>
+            </w:r>
+          </w:p>
+          <w:p>
+            <w:pPr>
+              <w:rPr>
+                <w:sz w:val="16"/>
+                <w:szCs w:val="16"/>
+              </w:rPr>
+            </w:pPr>
+          </w:p>
+          <w:p>
+            <w:pPr>
+              <w:rPr>
+                <w:sz w:val="16"/>
+                <w:szCs w:val="16"/>
+              </w:rPr>
+            </w:pPr>
+          </w:p>
+        </w:tc>
+        <w:tc>
+          <w:tcPr>
+            <w:tcW w:w="2410" w:type="dxa"/>
+          </w:tcPr>
+          <w:p>
+            <w:pPr>
+              <w:rPr>
+                <w:sz w:val="16"/>
+                <w:szCs w:val="16"/>
+              </w:rPr>
+            </w:pPr>
+            <w:r>
+              <w:rPr>
+                <w:sz w:val="16"/>
+                <w:szCs w:val="16"/>
+                <w:highlight w:val="green"/>
+              </w:rPr>
+              <w:t>Remove “SingleStrokeFont.txt” from Robot writer folder</w:t>
+            </w:r>
+            <w:r>
+              <w:rPr>
+                <w:sz w:val="16"/>
+                <w:szCs w:val="16"/>
+              </w:rPr>
+              <w:t xml:space="preserve"> </w:t>
+            </w:r>
+          </w:p>
+          <w:p>
+            <w:pPr>
+              <w:rPr>
+                <w:sz w:val="16"/>
+                <w:szCs w:val="16"/>
+              </w:rPr>
+            </w:pPr>
+          </w:p>
+          <w:p>
+            <w:pPr>
+              <w:rPr>
+                <w:b/>
+                <w:bCs/>
+                <w:sz w:val="16"/>
+                <w:szCs w:val="16"/>
+              </w:rPr>
+            </w:pPr>
+            <w:r>
+              <w:rPr>
+                <w:b/>
+                <w:bCs/>
+                <w:sz w:val="16"/>
+                <w:szCs w:val="16"/>
+              </w:rPr>
+              <w:t>MAYBE ADD:</w:t>
+            </w:r>
+          </w:p>
+          <w:p>
+            <w:pPr>
+              <w:rPr>
+                <w:sz w:val="16"/>
+                <w:szCs w:val="16"/>
+              </w:rPr>
+            </w:pPr>
             <w:r>
               <w:rPr>
                 <w:sz w:val="16"/>
                 <w:szCs w:val="16"/>
                 <w:highlight w:val="cyan"/>
               </w:rPr>
-              <w:t>” doesn’t contain all the data</w:t>
-            </w:r>
-          </w:p>
-          <w:p>
-            <w:pPr>
-              <w:rPr>
-                <w:sz w:val="16"/>
-                <w:szCs w:val="16"/>
-              </w:rPr>
-            </w:pPr>
-          </w:p>
-          <w:p>
-            <w:pPr>
-              <w:rPr>
-                <w:sz w:val="16"/>
-                <w:szCs w:val="16"/>
-              </w:rPr>
-            </w:pPr>
-          </w:p>
-        </w:tc>
-        <w:tc>
-          <w:tcPr>
-            <w:tcW w:w="2410" w:type="dxa"/>
+              <w:t>Remove half of the stroke lines in</w:t>
+            </w:r>
+            <w:r>
+              <w:rPr>
+                <w:sz w:val="16"/>
+                <w:szCs w:val="16"/>
+                <w:highlight w:val="cyan"/>
+              </w:rPr>
+              <w:t xml:space="preserve"> “SingleStrokeFont.txt”</w:t>
+            </w:r>
+            <w:r>
+              <w:rPr>
+                <w:sz w:val="16"/>
+                <w:szCs w:val="16"/>
+              </w:rPr>
+              <w:t xml:space="preserve"> </w:t>
+            </w:r>
+          </w:p>
+        </w:tc>
+        <w:tc>
+          <w:tcPr>
+            <w:tcW w:w="2925" w:type="dxa"/>
           </w:tcPr>
           <w:p>
             <w:pPr>
@@ -3092,30 +3170,7 @@
                 <w:szCs w:val="16"/>
                 <w:highlight w:val="green"/>
               </w:rPr>
-              <w:t xml:space="preserve">Remove </w:t>
-            </w:r>
-            <w:r>
-              <w:rPr>
-                <w:sz w:val="16"/>
-                <w:szCs w:val="16"/>
-                <w:highlight w:val="green"/>
-              </w:rPr>
-              <w:t>“SingleStrokeFont.txt”</w:t>
-            </w:r>
-            <w:r>
-              <w:rPr>
-                <w:sz w:val="16"/>
-                <w:szCs w:val="16"/>
-                <w:highlight w:val="green"/>
-              </w:rPr>
-              <w:t xml:space="preserve"> from Robot writer folder</w:t>
-            </w:r>
-            <w:r>
-              <w:rPr>
-                <w:sz w:val="16"/>
-                <w:szCs w:val="16"/>
-              </w:rPr>
-              <w:t xml:space="preserve"> </w:t>
+              <w:t>FP (file pointer) equals null, therefore user is told that “SingleStrokeFont.txt” couldn’t be found and the programme immediately ends</w:t>
             </w:r>
           </w:p>
           <w:p>
@@ -3158,134 +3213,7 @@
                 <w:szCs w:val="16"/>
                 <w:highlight w:val="cyan"/>
               </w:rPr>
-              <w:t>Remove half of the stroke lines in</w:t>
-            </w:r>
-            <w:r>
-              <w:rPr>
-                <w:sz w:val="16"/>
-                <w:szCs w:val="16"/>
-                <w:highlight w:val="cyan"/>
-              </w:rPr>
-              <w:t xml:space="preserve"> “SingleStrokeFont.txt</w:t>
-            </w:r>
-            <w:r>
-              <w:rPr>
-                <w:sz w:val="16"/>
-                <w:szCs w:val="16"/>
-                <w:highlight w:val="cyan"/>
-              </w:rPr>
-              <w:t>”</w:t>
-            </w:r>
-            <w:r>
-              <w:rPr>
-                <w:sz w:val="16"/>
-                <w:szCs w:val="16"/>
-              </w:rPr>
-              <w:t xml:space="preserve"> </w:t>
-            </w:r>
-          </w:p>
-        </w:tc>
-        <w:tc>
-          <w:tcPr>
-            <w:tcW w:w="2925" w:type="dxa"/>
-          </w:tcPr>
-          <w:p>
-            <w:pPr>
-              <w:rPr>
-                <w:sz w:val="16"/>
-                <w:szCs w:val="16"/>
-              </w:rPr>
-            </w:pPr>
-            <w:r>
-              <w:rPr>
-                <w:sz w:val="16"/>
-                <w:szCs w:val="16"/>
-                <w:highlight w:val="green"/>
-              </w:rPr>
-              <w:t xml:space="preserve">FP (file pointer) equals null, therefore user is told that </w:t>
-            </w:r>
-            <w:r>
-              <w:rPr>
-                <w:sz w:val="16"/>
-                <w:szCs w:val="16"/>
-                <w:highlight w:val="green"/>
-              </w:rPr>
-              <w:t>“SingleStrokeFont.txt</w:t>
-            </w:r>
-            <w:r>
-              <w:rPr>
-                <w:sz w:val="16"/>
-                <w:szCs w:val="16"/>
-                <w:highlight w:val="green"/>
-              </w:rPr>
-              <w:t>” couldn’t be found and the programme immediately ends</w:t>
-            </w:r>
-          </w:p>
-          <w:p>
-            <w:pPr>
-              <w:rPr>
-                <w:sz w:val="16"/>
-                <w:szCs w:val="16"/>
-              </w:rPr>
-            </w:pPr>
-          </w:p>
-          <w:p>
-            <w:pPr>
-              <w:rPr>
-                <w:b/>
-                <w:bCs/>
-                <w:sz w:val="16"/>
-                <w:szCs w:val="16"/>
-              </w:rPr>
-            </w:pPr>
-            <w:r>
-              <w:rPr>
-                <w:b/>
-                <w:bCs/>
-                <w:sz w:val="16"/>
-                <w:szCs w:val="16"/>
-              </w:rPr>
-              <w:t>MAYBE ADD:</w:t>
-            </w:r>
-          </w:p>
-          <w:p>
-            <w:pPr>
-              <w:rPr>
-                <w:sz w:val="16"/>
-                <w:szCs w:val="16"/>
-              </w:rPr>
-            </w:pPr>
-            <w:r>
-              <w:rPr>
-                <w:sz w:val="16"/>
-                <w:szCs w:val="16"/>
-                <w:highlight w:val="cyan"/>
-              </w:rPr>
-              <w:t xml:space="preserve">Font Count won’t equal 128, </w:t>
-            </w:r>
-            <w:r>
-              <w:rPr>
-                <w:sz w:val="16"/>
-                <w:szCs w:val="16"/>
-                <w:highlight w:val="cyan"/>
-              </w:rPr>
-              <w:t xml:space="preserve">therefore user is told that “SingleStrokeFont.txt” </w:t>
-            </w:r>
-            <w:r>
-              <w:rPr>
-                <w:sz w:val="16"/>
-                <w:szCs w:val="16"/>
-                <w:highlight w:val="cyan"/>
-              </w:rPr>
-              <w:t>doesn’t contain all ascii characters</w:t>
-            </w:r>
-            <w:r>
-              <w:rPr>
-                <w:sz w:val="16"/>
-                <w:szCs w:val="16"/>
-                <w:highlight w:val="cyan"/>
-              </w:rPr>
-              <w:t xml:space="preserve"> and the programme immediately ends</w:t>
+              <w:t>Font Count won’t equal 128, therefore user is told that “SingleStrokeFont.txt” doesn’t contain all ascii characters and the programme immediately ends</w:t>
             </w:r>
           </w:p>
           <w:p>
@@ -3551,31 +3479,7 @@
                 <w:szCs w:val="16"/>
                 <w:highlight w:val="cyan"/>
               </w:rPr>
-              <w:t>Tell user they didn’t input a number</w:t>
-            </w:r>
-            <w:r>
-              <w:rPr>
-                <w:sz w:val="16"/>
-                <w:szCs w:val="16"/>
-                <w:highlight w:val="cyan"/>
-              </w:rPr>
-              <w:t xml:space="preserve"> between 4 and 10, and then </w:t>
-            </w:r>
-            <w:r>
-              <w:rPr>
-                <w:sz w:val="16"/>
-                <w:szCs w:val="16"/>
-                <w:highlight w:val="cyan"/>
-              </w:rPr>
-              <w:t>repeat the function agai</w:t>
-            </w:r>
-            <w:r>
-              <w:rPr>
-                <w:sz w:val="16"/>
-                <w:szCs w:val="16"/>
-                <w:highlight w:val="cyan"/>
-              </w:rPr>
-              <w:t>n</w:t>
+              <w:t>Tell user they didn’t input a number between 4 and 10, and then repeat the function again</w:t>
             </w:r>
           </w:p>
           <w:p>
@@ -3633,23 +3537,7 @@
                 <w:szCs w:val="16"/>
                 <w:highlight w:val="green"/>
               </w:rPr>
-              <w:t xml:space="preserve">No </w:t>
-            </w:r>
-            <w:r>
-              <w:rPr>
-                <w:sz w:val="16"/>
-                <w:szCs w:val="16"/>
-                <w:highlight w:val="green"/>
-              </w:rPr>
-              <w:t>"SampleLines.txt"</w:t>
-            </w:r>
-            <w:r>
-              <w:rPr>
-                <w:sz w:val="16"/>
-                <w:szCs w:val="16"/>
-                <w:highlight w:val="green"/>
-              </w:rPr>
-              <w:t xml:space="preserve"> file</w:t>
+              <w:t>No "SampleLines.txt" file</w:t>
             </w:r>
           </w:p>
           <w:p>
@@ -4104,27 +3992,243 @@
         <w:t>AI Statement</w:t>
       </w:r>
     </w:p>
+    <w:p/>
+    <w:p/>
+    <w:p/>
+    <w:p/>
     <w:p>
       <w:pPr>
         <w:pStyle w:val="Heading1"/>
+        <w:jc w:val="center"/>
+        <w:rPr>
+          <w:b/>
+          <w:bCs/>
+          <w:u w:val="single"/>
+        </w:rPr>
       </w:pPr>
       <w:r>
+        <w:rPr>
+          <w:b/>
+          <w:bCs/>
+          <w:u w:val="single"/>
+        </w:rPr>
+        <w:lastRenderedPageBreak/>
         <w:t>Flowchart</w:t>
       </w:r>
       <w:r>
-        <w:t>(</w:t>
-      </w:r>
-      <w:r>
-        <w:t>s</w:t>
-      </w:r>
-      <w:r>
-        <w:t>)</w:t>
+        <w:rPr>
+          <w:b/>
+          <w:bCs/>
+          <w:u w:val="single"/>
+        </w:rPr>
+        <w:t>s:</w:t>
       </w:r>
     </w:p>
     <w:p>
-      <w:r>
-        <w:t>May be included as separate pdf</w:t>
-      </w:r>
+      <w:pPr>
+        <w:jc w:val="center"/>
+      </w:pPr>
+      <w:r>
+        <w:drawing>
+          <wp:inline distT="0" distB="0" distL="0" distR="0" wp14:anchorId="1629A0D1" wp14:editId="75AECDFD">
+            <wp:extent cx="5480423" cy="8450580"/>
+            <wp:effectExtent l="0" t="0" r="6350" b="7620"/>
+            <wp:docPr id="303325481" name="Picture 1"/>
+            <wp:cNvGraphicFramePr>
+              <a:graphicFrameLocks xmlns:a="http://schemas.openxmlformats.org/drawingml/2006/main" noChangeAspect="1"/>
+            </wp:cNvGraphicFramePr>
+            <a:graphic xmlns:a="http://schemas.openxmlformats.org/drawingml/2006/main">
+              <a:graphicData uri="http://schemas.openxmlformats.org/drawingml/2006/picture">
+                <pic:pic xmlns:pic="http://schemas.openxmlformats.org/drawingml/2006/picture">
+                  <pic:nvPicPr>
+                    <pic:cNvPr id="303325481" name=""/>
+                    <pic:cNvPicPr/>
+                  </pic:nvPicPr>
+                  <pic:blipFill>
+                    <a:blip r:embed="rId4"/>
+                    <a:stretch>
+                      <a:fillRect/>
+                    </a:stretch>
+                  </pic:blipFill>
+                  <pic:spPr>
+                    <a:xfrm>
+                      <a:off x="0" y="0"/>
+                      <a:ext cx="5493022" cy="8470007"/>
+                    </a:xfrm>
+                    <a:prstGeom prst="rect">
+                      <a:avLst/>
+                    </a:prstGeom>
+                  </pic:spPr>
+                </pic:pic>
+              </a:graphicData>
+            </a:graphic>
+          </wp:inline>
+        </w:drawing>
+      </w:r>
+    </w:p>
+    <w:p>
+      <w:pPr>
+        <w:jc w:val="center"/>
+      </w:pPr>
+      <w:r>
+        <w:lastRenderedPageBreak/>
+        <w:drawing>
+          <wp:inline distT="0" distB="0" distL="0" distR="0" wp14:anchorId="18D47FED" wp14:editId="57AA7546">
+            <wp:extent cx="5090160" cy="5546724"/>
+            <wp:effectExtent l="0" t="0" r="0" b="0"/>
+            <wp:docPr id="1437441412" name="Picture 1"/>
+            <wp:cNvGraphicFramePr>
+              <a:graphicFrameLocks xmlns:a="http://schemas.openxmlformats.org/drawingml/2006/main" noChangeAspect="1"/>
+            </wp:cNvGraphicFramePr>
+            <a:graphic xmlns:a="http://schemas.openxmlformats.org/drawingml/2006/main">
+              <a:graphicData uri="http://schemas.openxmlformats.org/drawingml/2006/picture">
+                <pic:pic xmlns:pic="http://schemas.openxmlformats.org/drawingml/2006/picture">
+                  <pic:nvPicPr>
+                    <pic:cNvPr id="1437441412" name=""/>
+                    <pic:cNvPicPr/>
+                  </pic:nvPicPr>
+                  <pic:blipFill rotWithShape="1">
+                    <a:blip r:embed="rId5"/>
+                    <a:srcRect l="11441" t="4383" r="11361"/>
+                    <a:stretch>
+                      <a:fillRect/>
+                    </a:stretch>
+                  </pic:blipFill>
+                  <pic:spPr bwMode="auto">
+                    <a:xfrm>
+                      <a:off x="0" y="0"/>
+                      <a:ext cx="5102341" cy="5559998"/>
+                    </a:xfrm>
+                    <a:prstGeom prst="rect">
+                      <a:avLst/>
+                    </a:prstGeom>
+                    <a:ln>
+                      <a:noFill/>
+                    </a:ln>
+                    <a:extLst>
+                      <a:ext uri="{53640926-AAD7-44D8-BBD7-CCE9431645EC}">
+                        <a14:shadowObscured xmlns:a14="http://schemas.microsoft.com/office/drawing/2010/main"/>
+                      </a:ext>
+                    </a:extLst>
+                  </pic:spPr>
+                </pic:pic>
+              </a:graphicData>
+            </a:graphic>
+          </wp:inline>
+        </w:drawing>
+      </w:r>
+      <w:r>
+        <w:drawing>
+          <wp:inline distT="0" distB="0" distL="0" distR="0" wp14:anchorId="4295D75E" wp14:editId="1249906B">
+            <wp:extent cx="5140841" cy="4211320"/>
+            <wp:effectExtent l="0" t="0" r="3175" b="0"/>
+            <wp:docPr id="948390168" name="Picture 1"/>
+            <wp:cNvGraphicFramePr>
+              <a:graphicFrameLocks xmlns:a="http://schemas.openxmlformats.org/drawingml/2006/main" noChangeAspect="1"/>
+            </wp:cNvGraphicFramePr>
+            <a:graphic xmlns:a="http://schemas.openxmlformats.org/drawingml/2006/main">
+              <a:graphicData uri="http://schemas.openxmlformats.org/drawingml/2006/picture">
+                <pic:pic xmlns:pic="http://schemas.openxmlformats.org/drawingml/2006/picture">
+                  <pic:nvPicPr>
+                    <pic:cNvPr id="948390168" name=""/>
+                    <pic:cNvPicPr/>
+                  </pic:nvPicPr>
+                  <pic:blipFill rotWithShape="1">
+                    <a:blip r:embed="rId6"/>
+                    <a:srcRect l="3435" t="5970" b="5224"/>
+                    <a:stretch>
+                      <a:fillRect/>
+                    </a:stretch>
+                  </pic:blipFill>
+                  <pic:spPr bwMode="auto">
+                    <a:xfrm>
+                      <a:off x="0" y="0"/>
+                      <a:ext cx="5146097" cy="4215626"/>
+                    </a:xfrm>
+                    <a:prstGeom prst="rect">
+                      <a:avLst/>
+                    </a:prstGeom>
+                    <a:ln>
+                      <a:noFill/>
+                    </a:ln>
+                    <a:extLst>
+                      <a:ext uri="{53640926-AAD7-44D8-BBD7-CCE9431645EC}">
+                        <a14:shadowObscured xmlns:a14="http://schemas.microsoft.com/office/drawing/2010/main"/>
+                      </a:ext>
+                    </a:extLst>
+                  </pic:spPr>
+                </pic:pic>
+              </a:graphicData>
+            </a:graphic>
+          </wp:inline>
+        </w:drawing>
+      </w:r>
+    </w:p>
+    <w:p>
+      <w:pPr>
+        <w:jc w:val="center"/>
+      </w:pPr>
+    </w:p>
+    <w:p>
+      <w:pPr>
+        <w:jc w:val="center"/>
+      </w:pPr>
+    </w:p>
+    <w:p>
+      <w:pPr>
+        <w:jc w:val="center"/>
+      </w:pPr>
+      <w:r>
+        <w:drawing>
+          <wp:inline distT="0" distB="0" distL="0" distR="0" wp14:anchorId="34B7C56D" wp14:editId="5007F818">
+            <wp:extent cx="6125871" cy="7153275"/>
+            <wp:effectExtent l="0" t="0" r="8255" b="0"/>
+            <wp:docPr id="1520534000" name="Picture 1"/>
+            <wp:cNvGraphicFramePr>
+              <a:graphicFrameLocks xmlns:a="http://schemas.openxmlformats.org/drawingml/2006/main" noChangeAspect="1"/>
+            </wp:cNvGraphicFramePr>
+            <a:graphic xmlns:a="http://schemas.openxmlformats.org/drawingml/2006/main">
+              <a:graphicData uri="http://schemas.openxmlformats.org/drawingml/2006/picture">
+                <pic:pic xmlns:pic="http://schemas.openxmlformats.org/drawingml/2006/picture">
+                  <pic:nvPicPr>
+                    <pic:cNvPr id="1520534000" name=""/>
+                    <pic:cNvPicPr/>
+                  </pic:nvPicPr>
+                  <pic:blipFill rotWithShape="1">
+                    <a:blip r:embed="rId7"/>
+                    <a:srcRect l="4075" r="2678"/>
+                    <a:stretch>
+                      <a:fillRect/>
+                    </a:stretch>
+                  </pic:blipFill>
+                  <pic:spPr bwMode="auto">
+                    <a:xfrm>
+                      <a:off x="0" y="0"/>
+                      <a:ext cx="6132837" cy="7161409"/>
+                    </a:xfrm>
+                    <a:prstGeom prst="rect">
+                      <a:avLst/>
+                    </a:prstGeom>
+                    <a:ln>
+                      <a:noFill/>
+                    </a:ln>
+                    <a:extLst>
+                      <a:ext uri="{53640926-AAD7-44D8-BBD7-CCE9431645EC}">
+                        <a14:shadowObscured xmlns:a14="http://schemas.microsoft.com/office/drawing/2010/main"/>
+                      </a:ext>
+                    </a:extLst>
+                  </pic:spPr>
+                </pic:pic>
+              </a:graphicData>
+            </a:graphic>
+          </wp:inline>
+        </w:drawing>
+      </w:r>
+    </w:p>
+    <w:p>
+      <w:pPr>
+        <w:jc w:val="center"/>
+      </w:pPr>
     </w:p>
     <w:sectPr>
       <w:pgSz w:w="11906" w:h="16838"/>
@@ -4748,6 +4852,7 @@
   <w:style w:type="character" w:default="1" w:styleId="DefaultParagraphFont">
     <w:name w:val="Default Paragraph Font"/>
     <w:uiPriority w:val="1"/>
+    <w:semiHidden/>
     <w:unhideWhenUsed/>
   </w:style>
   <w:style w:type="table" w:default="1" w:styleId="TableNormal">

</xml_diff>